<commit_message>
Update MI-CDM proposal document to v2.0 as-implemented
Adds the implementation outcome summary (final table sizes, validation
results), the VISCODE read-date finding and fix, resolved review
decisions, and the 2100000100 -> 2100000532 field concept deviation.
</commit_message>
<xml_diff>
--- a/docs/MI-CDM_Imaging_Metadata_ETL_Proposal.docx
+++ b/docs/MI-CDM_Imaging_Metadata_ETL_Proposal.docx
@@ -15,7 +15,7 @@
         <w:rPr>
           <w:b/>
         </w:rPr>
-        <w:t>Implementation Proposal - Draft v1.0 for Review</w:t>
+        <w:t>Implementation Proposal - v2.0 (As Implemented)</w:t>
         <w:br/>
       </w:r>
       <w:r>
@@ -26,7 +26,359 @@
         <w:rPr>
           <w:i/>
         </w:rPr>
-        <w:t>Status: awaiting approval; no code changes have been made.</w:t>
+        <w:t>Status: IMPLEMENTED on branch feature/mi-cdm-imaging-metadata (commit f42a5d9). All ETL validations pass. Sections below reflect the design as built; deviations from the reviewed draft are marked "[changed in implementation]".</w:t>
+      </w:r>
+    </w:p>
+    <w:p>
+      <w:pPr>
+        <w:pStyle w:val="Heading1"/>
+      </w:pPr>
+      <w:r>
+        <w:t>Implementation Outcome Summary</w:t>
+      </w:r>
+    </w:p>
+    <w:p>
+      <w:r>
+        <w:rPr>
+          <w:b w:val="0"/>
+          <w:i w:val="0"/>
+        </w:rPr>
+        <w:t>The extension was implemented and the full pipeline re-run successfully. Final table sizes:</w:t>
+      </w:r>
+    </w:p>
+    <w:tbl>
+      <w:tblPr>
+        <w:tblStyle w:val="TableGrid"/>
+        <w:tblW w:type="auto" w:w="0"/>
+        <w:tblLook w:firstColumn="1" w:firstRow="1" w:lastColumn="0" w:lastRow="0" w:noHBand="0" w:noVBand="1" w:val="04A0"/>
+      </w:tblPr>
+      <w:tblGrid>
+        <w:gridCol w:w="2412"/>
+        <w:gridCol w:w="2412"/>
+        <w:gridCol w:w="2412"/>
+        <w:gridCol w:w="2412"/>
+      </w:tblGrid>
+      <w:tr>
+        <w:tc>
+          <w:tcPr>
+            <w:tcW w:type="dxa" w:w="2160"/>
+          </w:tcPr>
+          <w:p>
+            <w:r/>
+            <w:r>
+              <w:rPr>
+                <w:b/>
+                <w:sz w:val="18"/>
+              </w:rPr>
+              <w:t>Table</w:t>
+            </w:r>
+          </w:p>
+        </w:tc>
+        <w:tc>
+          <w:tcPr>
+            <w:tcW w:type="dxa" w:w="1440"/>
+          </w:tcPr>
+          <w:p>
+            <w:r/>
+            <w:r>
+              <w:rPr>
+                <w:b/>
+                <w:sz w:val="18"/>
+              </w:rPr>
+              <w:t>Before</w:t>
+            </w:r>
+          </w:p>
+        </w:tc>
+        <w:tc>
+          <w:tcPr>
+            <w:tcW w:type="dxa" w:w="1440"/>
+          </w:tcPr>
+          <w:p>
+            <w:r/>
+            <w:r>
+              <w:rPr>
+                <w:b/>
+                <w:sz w:val="18"/>
+              </w:rPr>
+              <w:t>After</w:t>
+            </w:r>
+          </w:p>
+        </w:tc>
+        <w:tc>
+          <w:tcPr>
+            <w:tcW w:type="dxa" w:w="4752"/>
+          </w:tcPr>
+          <w:p>
+            <w:r/>
+            <w:r>
+              <w:rPr>
+                <w:b/>
+                <w:sz w:val="18"/>
+              </w:rPr>
+              <w:t>Notes</w:t>
+            </w:r>
+          </w:p>
+        </w:tc>
+      </w:tr>
+      <w:tr>
+        <w:tc>
+          <w:tcPr>
+            <w:tcW w:type="dxa" w:w="2160"/>
+          </w:tcPr>
+          <w:p>
+            <w:r/>
+            <w:r>
+              <w:rPr>
+                <w:sz w:val="18"/>
+              </w:rPr>
+              <w:t>image_occurrence</w:t>
+            </w:r>
+          </w:p>
+        </w:tc>
+        <w:tc>
+          <w:tcPr>
+            <w:tcW w:type="dxa" w:w="1440"/>
+          </w:tcPr>
+          <w:p>
+            <w:r/>
+            <w:r>
+              <w:rPr>
+                <w:sz w:val="18"/>
+              </w:rPr>
+              <w:t>23,898</w:t>
+            </w:r>
+          </w:p>
+        </w:tc>
+        <w:tc>
+          <w:tcPr>
+            <w:tcW w:type="dxa" w:w="1440"/>
+          </w:tcPr>
+          <w:p>
+            <w:r/>
+            <w:r>
+              <w:rPr>
+                <w:sz w:val="18"/>
+              </w:rPr>
+              <w:t>44,941</w:t>
+            </w:r>
+          </w:p>
+        </w:tc>
+        <w:tc>
+          <w:tcPr>
+            <w:tcW w:type="dxa" w:w="4752"/>
+          </w:tcPr>
+          <w:p>
+            <w:r/>
+            <w:r>
+              <w:rPr>
+                <w:sz w:val="18"/>
+              </w:rPr>
+              <w:t>43,512 sidecar series (authoritative) + 1,429 tabular fallback; 22,469 old tabular rows superseded by sidecar series</w:t>
+            </w:r>
+          </w:p>
+        </w:tc>
+      </w:tr>
+      <w:tr>
+        <w:tc>
+          <w:tcPr>
+            <w:tcW w:type="dxa" w:w="2160"/>
+          </w:tcPr>
+          <w:p>
+            <w:r/>
+            <w:r>
+              <w:rPr>
+                <w:sz w:val="18"/>
+              </w:rPr>
+              <w:t>procedure_occurrence</w:t>
+            </w:r>
+          </w:p>
+        </w:tc>
+        <w:tc>
+          <w:tcPr>
+            <w:tcW w:type="dxa" w:w="1440"/>
+          </w:tcPr>
+          <w:p>
+            <w:r/>
+            <w:r>
+              <w:rPr>
+                <w:sz w:val="18"/>
+              </w:rPr>
+              <w:t>20,783</w:t>
+            </w:r>
+          </w:p>
+        </w:tc>
+        <w:tc>
+          <w:tcPr>
+            <w:tcW w:type="dxa" w:w="1440"/>
+          </w:tcPr>
+          <w:p>
+            <w:r/>
+            <w:r>
+              <w:rPr>
+                <w:sz w:val="18"/>
+              </w:rPr>
+              <w:t>23,881</w:t>
+            </w:r>
+          </w:p>
+        </w:tc>
+        <w:tc>
+          <w:tcPr>
+            <w:tcW w:type="dxa" w:w="4752"/>
+          </w:tcPr>
+          <w:p>
+            <w:r/>
+            <w:r>
+              <w:rPr>
+                <w:sz w:val="18"/>
+              </w:rPr>
+              <w:t>+3,098 sidecar-only sessions (screen-fail screening PETs, MR-only visits); 11,298 sessions matched existing procedures</w:t>
+            </w:r>
+          </w:p>
+        </w:tc>
+      </w:tr>
+      <w:tr>
+        <w:tc>
+          <w:tcPr>
+            <w:tcW w:type="dxa" w:w="2160"/>
+          </w:tcPr>
+          <w:p>
+            <w:r/>
+            <w:r>
+              <w:rPr>
+                <w:sz w:val="18"/>
+              </w:rPr>
+              <w:t>measurement</w:t>
+            </w:r>
+          </w:p>
+        </w:tc>
+        <w:tc>
+          <w:tcPr>
+            <w:tcW w:type="dxa" w:w="1440"/>
+          </w:tcPr>
+          <w:p>
+            <w:r/>
+            <w:r>
+              <w:rPr>
+                <w:sz w:val="18"/>
+              </w:rPr>
+              <w:t>4,451,784</w:t>
+            </w:r>
+          </w:p>
+        </w:tc>
+        <w:tc>
+          <w:tcPr>
+            <w:tcW w:type="dxa" w:w="1440"/>
+          </w:tcPr>
+          <w:p>
+            <w:r/>
+            <w:r>
+              <w:rPr>
+                <w:sz w:val="18"/>
+              </w:rPr>
+              <w:t>5,723,045</w:t>
+            </w:r>
+          </w:p>
+        </w:tc>
+        <w:tc>
+          <w:tcPr>
+            <w:tcW w:type="dxa" w:w="4752"/>
+          </w:tcPr>
+          <w:p>
+            <w:r/>
+            <w:r>
+              <w:rPr>
+                <w:sz w:val="18"/>
+              </w:rPr>
+              <w:t>+1,271,111 DICOM metadata rows (572,405 numeric; 350,831 with value concepts) plus derived-measurement changes</w:t>
+            </w:r>
+          </w:p>
+        </w:tc>
+      </w:tr>
+      <w:tr>
+        <w:tc>
+          <w:tcPr>
+            <w:tcW w:type="dxa" w:w="2160"/>
+          </w:tcPr>
+          <w:p>
+            <w:r/>
+            <w:r>
+              <w:rPr>
+                <w:sz w:val="18"/>
+              </w:rPr>
+              <w:t>image_feature</w:t>
+            </w:r>
+          </w:p>
+        </w:tc>
+        <w:tc>
+          <w:tcPr>
+            <w:tcW w:type="dxa" w:w="1440"/>
+          </w:tcPr>
+          <w:p>
+            <w:r/>
+            <w:r>
+              <w:rPr>
+                <w:sz w:val="18"/>
+              </w:rPr>
+              <w:t>639,716</w:t>
+            </w:r>
+          </w:p>
+        </w:tc>
+        <w:tc>
+          <w:tcPr>
+            <w:tcW w:type="dxa" w:w="1440"/>
+          </w:tcPr>
+          <w:p>
+            <w:r/>
+            <w:r>
+              <w:rPr>
+                <w:sz w:val="18"/>
+              </w:rPr>
+              <w:t>662,276</w:t>
+            </w:r>
+          </w:p>
+        </w:tc>
+        <w:tc>
+          <w:tcPr>
+            <w:tcW w:type="dxa" w:w="4752"/>
+          </w:tcPr>
+          <w:p>
+            <w:r/>
+            <w:r>
+              <w:rPr>
+                <w:sz w:val="18"/>
+              </w:rPr>
+              <w:t>0 unmatched feature groups - a net gain: the old date-only matching had been silently losing ~22k rows (see finding below)</w:t>
+            </w:r>
+          </w:p>
+        </w:tc>
+      </w:tr>
+    </w:tbl>
+    <w:p/>
+    <w:p>
+      <w:r>
+        <w:rPr>
+          <w:b w:val="0"/>
+          <w:i w:val="0"/>
+        </w:rPr>
+        <w:t>Validation: all pre-existing checks pass (person, visit, orphans, observation periods, drug exposure) and all new MI-CDM checks pass - required IMAGE_OCCURRENCE fields fully populated, sidecar reconciliation exact (43,512 = 43,512), zero procedure/feature/event-link orphans, 99.47% sidecar visit linkage (231 series on consent-date fallback, dominated by the 39 early-termination files with no SV row).</w:t>
+      </w:r>
+    </w:p>
+    <w:p>
+      <w:r>
+        <w:rPr>
+          <w:b/>
+          <w:i w:val="0"/>
+        </w:rPr>
+        <w:t>Finding surfaced during verification - acquisition VISCODE matching:</w:t>
+      </w:r>
+    </w:p>
+    <w:p>
+      <w:r>
+        <w:rPr>
+          <w:b w:val="0"/>
+          <w:i w:val="0"/>
+        </w:rPr>
+        <w:t>The first implementation run dropped 5,780 derived-feature groups. Tracing exposed a source-data trap: imaging_PET_VA.csv (and to a lesser degree the volumetric MRI and MRI-reads files) dates rows by the READ date - up to years after acquisition - while the VISCODE names the scan visit. The old pipeline was already losing ~22k feature rows to this silently. Fix: imaging measurements now carry a _mi_cdm_viscode annotation from their source rows, and image_feature occurrence matching is VISCODE-first (then visit, then date, then modality fallbacks). Result: zero unmatched groups.</w:t>
       </w:r>
     </w:p>
     <w:p>
@@ -1412,7 +1764,7 @@
               <w:rPr>
                 <w:sz w:val="18"/>
               </w:rPr>
-              <w:t>NEW custom concept 2100000100 "image_occurrence.image_occurrence_id" - no standard concept exists for this extension-table field</w:t>
+              <w:t>NEW custom concept 2100000532 "image_occurrence.image_occurrence_id" - no standard concept exists for this extension-table field. [changed in implementation: the draft proposed 2100000100, but the A4_LEARN vocabulary already occupies scattered ids up to 2100000531, so the contiguous free block starting at 2100000532 was used]</w:t>
             </w:r>
           </w:p>
         </w:tc>
@@ -1948,7 +2300,7 @@
           <w:b w:val="0"/>
           <w:i w:val="0"/>
         </w:rPr>
-        <w:t>New custom concepts required (added to custom_vocabulary/CONCEPT.csv):</w:t>
+        <w:t>Custom concepts added to custom_vocabulary/CONCEPT.csv and custom_concepts_needed.csv (35 total): [as implemented]</w:t>
       </w:r>
     </w:p>
     <w:p>
@@ -1956,7 +2308,7 @@
         <w:pStyle w:val="ListBullet"/>
       </w:pPr>
       <w:r>
-        <w:t>2100000100 "image_occurrence.image_occurrence_id" (Field concept, A4_LEARN vocabulary) - used as meas_event_field_concept_id.</w:t>
+        <w:t>2100000532 "image_occurrence.image_occurrence_id" (Field concept, A4_LEARN vocabulary) - used as meas_event_field_concept_id on every DICOM metadata measurement.</w:t>
       </w:r>
     </w:p>
     <w:p>
@@ -1964,7 +2316,7 @@
         <w:pStyle w:val="ListBullet"/>
       </w:pPr>
       <w:r>
-        <w:t>Optionally ~25 DICOM value concepts for Tier C closed value sets (Decision 2).</w:t>
+        <w:t>2100000533-2100000566: 34 DICOM value concepts minted for the Tier C closed defined-term sets actually observed in A4_JSONS (Decision 2 approved). Vendor terms (e.g. *_GEMS) deliberately remain unmapped, keeping their raw string as source value.</w:t>
       </w:r>
     </w:p>
     <w:p>
@@ -1972,7 +2324,16 @@
         <w:pStyle w:val="ListBullet"/>
       </w:pPr>
       <w:r>
-        <w:t>The DICOM staging vocabulary itself (omop_table_staging_v5.csv, 8,811 concepts) is added to the vocabulary load path (copy_vocabulary.py / PostgreSQL loader) so concept joins resolve.</w:t>
+        <w:t>The DICOM staging vocabulary itself (omop_table_staging_v5.csv, 8,811 concepts) must be loaded into CONCEPT alongside the custom vocabulary so concept joins resolve.</w:t>
+      </w:r>
+    </w:p>
+    <w:p>
+      <w:r>
+        <w:rPr>
+          <w:b w:val="0"/>
+          <w:i w:val="0"/>
+        </w:rPr>
+        <w:t>Implementation notes: SAR has no UCUM W/kg concept, so its unit is carried as source value only. PatientPosition FFS resolved to the existing staging concept 2128009367 (Feet First-Supine) rather than a minted custom.</w:t>
       </w:r>
     </w:p>
     <w:p>
@@ -2230,7 +2591,7 @@
               <w:rPr>
                 <w:sz w:val="18"/>
               </w:rPr>
-              <w:t>Emit procedures from the JSON index for sessions without results-file procedures</w:t>
+              <w:t>Unchanged [implementation note: the JSON-driven procedure extension lives in image_metadata.extend_procedures_from_json(), which reuses existing procedures by visit or exact date and creates the remainder with type 32817 EHR]</w:t>
             </w:r>
           </w:p>
         </w:tc>
@@ -2260,7 +2621,37 @@
               <w:rPr>
                 <w:sz w:val="18"/>
               </w:rPr>
-              <w:t>1147138 -&gt; 1147330; resolve to JSON-backed occurrences</w:t>
+              <w:t>1147138 -&gt; 1147330 (decision logged in docs/Concept_Mapping_Decisions.md - supersedes 2026-07 audit finding C11); VISCODE-first occurrence matching; backfill_measurement_event_links() per guide section 7</w:t>
+            </w:r>
+          </w:p>
+        </w:tc>
+      </w:tr>
+      <w:tr>
+        <w:tc>
+          <w:tcPr>
+            <w:tcW w:type="dxa" w:w="3744"/>
+          </w:tcPr>
+          <w:p>
+            <w:r/>
+            <w:r>
+              <w:rPr>
+                <w:sz w:val="18"/>
+              </w:rPr>
+              <w:t>a4_omop_etl/measurement_imaging.py</w:t>
+            </w:r>
+          </w:p>
+        </w:tc>
+        <w:tc>
+          <w:tcPr>
+            <w:tcW w:type="dxa" w:w="6048"/>
+          </w:tcPr>
+          <w:p>
+            <w:r/>
+            <w:r>
+              <w:rPr>
+                <w:sz w:val="18"/>
+              </w:rPr>
+              <w:t>[added in implementation] _mi_cdm_viscode annotation on all imaging measurement builders so features can match their acquisition series (see VISCODE finding above)</w:t>
             </w:r>
           </w:p>
         </w:tc>
@@ -2479,7 +2870,7 @@
         <w:pStyle w:val="Heading1"/>
       </w:pPr>
       <w:r>
-        <w:t>7. Volume Impact (estimates)</w:t>
+        <w:t>7. Volume Impact (draft estimates - see Implementation Outcome Summary for actuals)</w:t>
       </w:r>
     </w:p>
     <w:tbl>
@@ -2795,7 +3186,16 @@
         <w:pStyle w:val="Heading1"/>
       </w:pPr>
       <w:r>
-        <w:t>8. Decisions Requested from Reviewers</w:t>
+        <w:t>8. Review Decisions - Resolved</w:t>
+      </w:r>
+    </w:p>
+    <w:p>
+      <w:r>
+        <w:rPr>
+          <w:b w:val="0"/>
+          <w:i w:val="0"/>
+        </w:rPr>
+        <w:t>All six decisions were approved as recommended and are implemented:</w:t>
       </w:r>
     </w:p>
     <w:tbl>
@@ -2827,7 +3227,7 @@
         </w:tc>
         <w:tc>
           <w:tcPr>
-            <w:tcW w:type="dxa" w:w="4896"/>
+            <w:tcW w:type="dxa" w:w="3168"/>
           </w:tcPr>
           <w:p>
             <w:r/>
@@ -2842,7 +3242,7 @@
         </w:tc>
         <w:tc>
           <w:tcPr>
-            <w:tcW w:type="dxa" w:w="4464"/>
+            <w:tcW w:type="dxa" w:w="6192"/>
           </w:tcPr>
           <w:p>
             <w:r/>
@@ -2851,7 +3251,7 @@
                 <w:b/>
                 <w:sz w:val="18"/>
               </w:rPr>
-              <w:t>Recommendation</w:t>
+              <w:t>Resolution (as implemented)</w:t>
             </w:r>
           </w:p>
         </w:tc>
@@ -2873,7 +3273,7 @@
         </w:tc>
         <w:tc>
           <w:tcPr>
-            <w:tcW w:type="dxa" w:w="4896"/>
+            <w:tcW w:type="dxa" w:w="3168"/>
           </w:tcPr>
           <w:p>
             <w:r/>
@@ -2881,13 +3281,13 @@
               <w:rPr>
                 <w:sz w:val="18"/>
               </w:rPr>
-              <w:t>Metadata depth: Tiers A+B+C+D (~57 attributes) vs. a leaner A+B core</w:t>
-            </w:r>
-          </w:p>
-        </w:tc>
-        <w:tc>
-          <w:tcPr>
-            <w:tcW w:type="dxa" w:w="4464"/>
+              <w:t>Metadata depth</w:t>
+            </w:r>
+          </w:p>
+        </w:tc>
+        <w:tc>
+          <w:tcPr>
+            <w:tcW w:type="dxa" w:w="6192"/>
           </w:tcPr>
           <w:p>
             <w:r/>
@@ -2895,7 +3295,7 @@
               <w:rPr>
                 <w:sz w:val="18"/>
               </w:rPr>
-              <w:t>Full A-D whitelist; curated per guide 5.1, excludes the 55 low-value/unmappable keys</w:t>
+              <w:t>Full A-D whitelist: 57 attributes in concept_maps/dicom_attributes.csv -&gt; 1,271,111 MEASUREMENT rows</w:t>
             </w:r>
           </w:p>
         </w:tc>
@@ -2917,7 +3317,7 @@
         </w:tc>
         <w:tc>
           <w:tcPr>
-            <w:tcW w:type="dxa" w:w="4896"/>
+            <w:tcW w:type="dxa" w:w="3168"/>
           </w:tcPr>
           <w:p>
             <w:r/>
@@ -2925,13 +3325,13 @@
               <w:rPr>
                 <w:sz w:val="18"/>
               </w:rPr>
-              <w:t>Tier C coded values: mint ~25 custom DICOM value concepts vs. source-value only</w:t>
-            </w:r>
-          </w:p>
-        </w:tc>
-        <w:tc>
-          <w:tcPr>
-            <w:tcW w:type="dxa" w:w="4464"/>
+              <w:t>Tier C coded values</w:t>
+            </w:r>
+          </w:p>
+        </w:tc>
+        <w:tc>
+          <w:tcPr>
+            <w:tcW w:type="dxa" w:w="6192"/>
           </w:tcPr>
           <w:p>
             <w:r/>
@@ -2939,7 +3339,7 @@
               <w:rPr>
                 <w:sz w:val="18"/>
               </w:rPr>
-              <w:t>Mint them - closed DICOM defined-term sets, cheap, makes values queryable</w:t>
+              <w:t>Minted: 34 A4_LEARN value concepts (2100000533-2100000566), restricted to observed DICOM defined terms; vendor terms stay source-value only</w:t>
             </w:r>
           </w:p>
         </w:tc>
@@ -2961,7 +3361,7 @@
         </w:tc>
         <w:tc>
           <w:tcPr>
-            <w:tcW w:type="dxa" w:w="4896"/>
+            <w:tcW w:type="dxa" w:w="3168"/>
           </w:tcPr>
           <w:p>
             <w:r/>
@@ -2969,13 +3369,13 @@
               <w:rPr>
                 <w:sz w:val="18"/>
               </w:rPr>
-              <w:t>Include the 3,207 screen-fail screening PETs</w:t>
-            </w:r>
-          </w:p>
-        </w:tc>
-        <w:tc>
-          <w:tcPr>
-            <w:tcW w:type="dxa" w:w="4464"/>
+              <w:t>Screen-fail screening PETs</w:t>
+            </w:r>
+          </w:p>
+        </w:tc>
+        <w:tc>
+          <w:tcPr>
+            <w:tcW w:type="dxa" w:w="6192"/>
           </w:tcPr>
           <w:p>
             <w:r/>
@@ -2983,7 +3383,7 @@
               <w:rPr>
                 <w:sz w:val="18"/>
               </w:rPr>
-              <w:t>Yes - persons and visits already exist; extends amyloid PET coverage to 2,772 screen-fails</w:t>
+              <w:t>Included: 3,207 SF series, extending amyloid PET coverage to 2,772 screen-fail participants</w:t>
             </w:r>
           </w:p>
         </w:tc>
@@ -3005,7 +3405,7 @@
         </w:tc>
         <w:tc>
           <w:tcPr>
-            <w:tcW w:type="dxa" w:w="4896"/>
+            <w:tcW w:type="dxa" w:w="3168"/>
           </w:tcPr>
           <w:p>
             <w:r/>
@@ -3013,13 +3413,13 @@
               <w:rPr>
                 <w:sz w:val="18"/>
               </w:rPr>
-              <w:t>Carry StudyDescription/SeriesDescription (contain BID) into MEASUREMENT</w:t>
-            </w:r>
-          </w:p>
-        </w:tc>
-        <w:tc>
-          <w:tcPr>
-            <w:tcW w:type="dxa" w:w="4464"/>
+              <w:t>StudyDescription/SeriesDescription (contain BID)</w:t>
+            </w:r>
+          </w:p>
+        </w:tc>
+        <w:tc>
+          <w:tcPr>
+            <w:tcW w:type="dxa" w:w="6192"/>
           </w:tcPr>
           <w:p>
             <w:r/>
@@ -3027,7 +3427,7 @@
               <w:rPr>
                 <w:sz w:val="18"/>
               </w:rPr>
-              <w:t>Yes - no new identifier beyond person_source_value; flag for governance sign-off</w:t>
+              <w:t>Carried into MEASUREMENT as source values (same identifier already in person_source_value); flagged for governance sign-off</w:t>
             </w:r>
           </w:p>
         </w:tc>
@@ -3049,7 +3449,7 @@
         </w:tc>
         <w:tc>
           <w:tcPr>
-            <w:tcW w:type="dxa" w:w="4896"/>
+            <w:tcW w:type="dxa" w:w="3168"/>
           </w:tcPr>
           <w:p>
             <w:r/>
@@ -3057,13 +3457,13 @@
               <w:rPr>
                 <w:sz w:val="18"/>
               </w:rPr>
-              <w:t>image_feature_event_field_concept_id 1147138 -&gt; 1147330</w:t>
-            </w:r>
-          </w:p>
-        </w:tc>
-        <w:tc>
-          <w:tcPr>
-            <w:tcW w:type="dxa" w:w="4464"/>
+              <w:t>image_feature_event_field_concept_id</w:t>
+            </w:r>
+          </w:p>
+        </w:tc>
+        <w:tc>
+          <w:tcPr>
+            <w:tcW w:type="dxa" w:w="6192"/>
           </w:tcPr>
           <w:p>
             <w:r/>
@@ -3071,7 +3471,7 @@
               <w:rPr>
                 <w:sz w:val="18"/>
               </w:rPr>
-              <w:t>Change to 1147330 per the author's guide (reverses a documented in-code decision)</w:t>
+              <w:t>Changed to 1147330 per the author's guide; decision and its reversal of audit finding C11 logged in docs/Concept_Mapping_Decisions.md</w:t>
             </w:r>
           </w:p>
         </w:tc>
@@ -3093,7 +3493,7 @@
         </w:tc>
         <w:tc>
           <w:tcPr>
-            <w:tcW w:type="dxa" w:w="4896"/>
+            <w:tcW w:type="dxa" w:w="3168"/>
           </w:tcPr>
           <w:p>
             <w:r/>
@@ -3101,13 +3501,13 @@
               <w:rPr>
                 <w:sz w:val="18"/>
               </w:rPr>
-              <w:t>One IMAGE_OCCURRENCE per JSON array element (43,512) vs. per file (42,626)</w:t>
-            </w:r>
-          </w:p>
-        </w:tc>
-        <w:tc>
-          <w:tcPr>
-            <w:tcW w:type="dxa" w:w="4464"/>
+              <w:t>Series grain for multi-reconstruction PET files</w:t>
+            </w:r>
+          </w:p>
+        </w:tc>
+        <w:tc>
+          <w:tcPr>
+            <w:tcW w:type="dxa" w:w="6192"/>
           </w:tcPr>
           <w:p>
             <w:r/>
@@ -3115,7 +3515,7 @@
               <w:rPr>
                 <w:sz w:val="18"/>
               </w:rPr>
-              <w:t>Per element - each has a distinct SeriesNumber and is a distinct DICOM series</w:t>
+              <w:t>One IMAGE_OCCURRENCE per JSON array element: 43,512 series from 42,626 files; local_path carries a #series={SeriesNumber} suffix for array elements</w:t>
             </w:r>
           </w:p>
         </w:tc>
@@ -8585,7 +8985,7 @@
           <w:b w:val="0"/>
           <w:i w:val="0"/>
         </w:rPr>
-        <w:t>Tier key: A = A - numeric (value_as_number); B = B - coded, value concept available; C = C - coded, value concept to be created / source value; D = D - free text (source value only); X = X - concept exists, excluded (structural / low value)</w:t>
+        <w:t>Tier key: A = A - numeric (value_as_number); B = B - coded, value concept available; C = C - coded, custom A4_LEARN value concept (minted 2100000533-2100000566); D = D - free text (source value only); X = X - concept exists, excluded (structural / low value)</w:t>
       </w:r>
     </w:p>
     <w:p>

</xml_diff>